<commit_message>
Add live portfolio link to CV and Portfolio PDFs
</commit_message>
<xml_diff>
--- a/Engr_Muhammad_Waqas_CV.docx
+++ b/Engr_Muhammad_Waqas_CV.docx
@@ -66,6 +66,17 @@
             <w:pPr>
               <w:spacing w:after="120"/>
             </w:pPr>
+            <w:r>
+              <w:rPr>
+                <w:b/>
+                <w:color w:val="0D9488"/>
+                <w:sz w:val="17"/>
+              </w:rPr>
+              <w:t xml:space="preserve">Web Portfolio: </w:t>
+            </w:r>
+            <w:r>
+              <w:t xml:space="preserve">engrwaqas034-ai.github.io/Personal_Portfolio   |   </w:t>
+            </w:r>
             <w:r>
               <w:rPr>
                 <w:b/>

</xml_diff>